<commit_message>
Paper A: Einreichformat Computers & Geosciences
- Literaturverweise im Autor-Jahr-Stil, Liste alphabetisch.
- Highlights als eigene Datei (Highlights.md/.docx), aus dem Manuskript raus.
- Word-Fassung doppelzeilig mit Zeilennummern (reference_cageo.docx, A4).
- Anschreiben (Cover_Letter.md/.docx).
- build.sh erzeugt alle Einreichdateien aus den Markdown-Quellen.
Trennlinien entfernt. Inhalt unveraendert.

Co-Authored-By: Claude Opus 5.5 <noreply@anthropic.com>
Claude-Session: https://claude.ai/code/session_013WHGNh61Va4DrXQ4AxtPNr
</commit_message>
<xml_diff>
--- a/Paper_ODT/Panorama_Pipeline_Paper/Manuscript_EN.docx
+++ b/Paper_ODT/Panorama_Pipeline_Paper/Manuscript_EN.docx
@@ -164,13 +164,6 @@
         <w:t xml:space="preserve">Angel Naya, angel.naya@posteo.de</w:t>
       </w:r>
     </w:p>
-    <w:p>
-      <w:r>
-        <w:pict>
-          <v:rect style="width:0;height:1.5pt" o:hralign="center" o:hrstd="t" o:hr="t"/>
-        </w:pict>
-      </w:r>
-    </w:p>
     <w:bookmarkStart w:id="20" w:name="abstract"/>
     <w:p>
       <w:pPr>
@@ -302,97 +295,13 @@
         <w:t xml:space="preserve">open-source; self-hosting; Docker; web visualization</w:t>
       </w:r>
     </w:p>
-    <w:p>
-      <w:r>
-        <w:pict>
-          <v:rect style="width:0;height:1.5pt" o:hralign="center" o:hrstd="t" o:hr="t"/>
-        </w:pict>
-      </w:r>
-    </w:p>
     <w:bookmarkEnd w:id="20"/>
-    <w:bookmarkStart w:id="21" w:name="highlights"/>
+    <w:bookmarkStart w:id="21" w:name="introduction"/>
     <w:p>
       <w:pPr>
         <w:pStyle w:val="Heading2"/>
       </w:pPr>
       <w:r>
-        <w:t xml:space="preserve">Highlights</w:t>
-      </w:r>
-    </w:p>
-    <w:p>
-      <w:pPr>
-        <w:numPr>
-          <w:ilvl w:val="0"/>
-          <w:numId w:val="1001"/>
-        </w:numPr>
-        <w:pStyle w:val="Compact"/>
-      </w:pPr>
-      <w:r>
-        <w:t xml:space="preserve">Open, containerized GUI chain turns 360° and TLS captures into web 3D scenes</w:t>
-      </w:r>
-    </w:p>
-    <w:p>
-      <w:pPr>
-        <w:numPr>
-          <w:ilvl w:val="0"/>
-          <w:numId w:val="1001"/>
-        </w:numPr>
-        <w:pStyle w:val="Compact"/>
-      </w:pPr>
-      <w:r>
-        <w:t xml:space="preserve">The input class is detected automatically: stitch, reproject, or take over</w:t>
-      </w:r>
-    </w:p>
-    <w:p>
-      <w:pPr>
-        <w:numPr>
-          <w:ilvl w:val="0"/>
-          <w:numId w:val="1001"/>
-        </w:numPr>
-        <w:pStyle w:val="Compact"/>
-      </w:pPr>
-      <w:r>
-        <w:t xml:space="preserve">Pose-based reprojection of E57 scanner images beats stitching on every metric</w:t>
-      </w:r>
-    </w:p>
-    <w:p>
-      <w:pPr>
-        <w:numPr>
-          <w:ilvl w:val="0"/>
-          <w:numId w:val="1001"/>
-        </w:numPr>
-        <w:pStyle w:val="Compact"/>
-      </w:pPr>
-      <w:r>
-        <w:t xml:space="preserve">Reprojection gives usable panoramas for 11 of 11 scenes, stitching for 6</w:t>
-      </w:r>
-    </w:p>
-    <w:p>
-      <w:pPr>
-        <w:numPr>
-          <w:ilvl w:val="0"/>
-          <w:numId w:val="1001"/>
-        </w:numPr>
-        <w:pStyle w:val="Compact"/>
-      </w:pPr>
-      <w:r>
-        <w:t xml:space="preserve">Real parallax raises seam offset ~56× over a parallax-free synthetic control</w:t>
-      </w:r>
-    </w:p>
-    <w:p>
-      <w:r>
-        <w:pict>
-          <v:rect style="width:0;height:1.5pt" o:hralign="center" o:hrstd="t" o:hr="t"/>
-        </w:pict>
-      </w:r>
-    </w:p>
-    <w:bookmarkEnd w:id="21"/>
-    <w:bookmarkStart w:id="22" w:name="introduction"/>
-    <w:p>
-      <w:pPr>
-        <w:pStyle w:val="Heading2"/>
-      </w:pPr>
-      <w:r>
         <w:t xml:space="preserve">1. Introduction</w:t>
       </w:r>
     </w:p>
@@ -449,13 +358,13 @@
         <w:t xml:space="preserve"> </w:t>
       </w:r>
       <w:r>
-        <w:t xml:space="preserve">geometry in the E57 exchange format [5], yet these images serve mainly to colourize</w:t>
-      </w:r>
-      <w:r>
-        <w:t xml:space="preserve"> </w:t>
-      </w:r>
-      <w:r>
-        <w:t xml:space="preserve">the point cloud or, as panoramic reflectance images, to register scans [6, 7] — not</w:t>
+        <w:t xml:space="preserve">geometry in the E57 exchange format (Huber, 2011), yet these images serve mainly to colourize</w:t>
+      </w:r>
+      <w:r>
+        <w:t xml:space="preserve"> </w:t>
+      </w:r>
+      <w:r>
+        <w:t xml:space="preserve">the point cloud or, as panoramic reflectance images, to register scans (Houshiar et al., 2015; Kang et al., 2009) — not</w:t>
       </w:r>
       <w:r>
         <w:t xml:space="preserve"> </w:t>
@@ -475,7 +384,7 @@
         <w:t xml:space="preserve"> </w:t>
       </w:r>
       <w:r>
-        <w:t xml:space="preserve">component — panorama stitching [1, 2] and web panorama viewers [3] are established</w:t>
+        <w:t xml:space="preserve">component — panorama stitching (Brown and Lowe, 2007; Szeliski, 2006) and web panorama viewers (Petroff, 2019) are established</w:t>
       </w:r>
       <w:r>
         <w:t xml:space="preserve"> </w:t>
@@ -552,8 +461,8 @@
         <w:t xml:space="preserve">360° cameras to survey-grade TLS.</w:t>
       </w:r>
     </w:p>
-    <w:bookmarkEnd w:id="22"/>
-    <w:bookmarkStart w:id="28" w:name="software-design"/>
+    <w:bookmarkEnd w:id="21"/>
+    <w:bookmarkStart w:id="27" w:name="software-design"/>
     <w:p>
       <w:pPr>
         <w:pStyle w:val="Heading2"/>
@@ -562,7 +471,7 @@
         <w:t xml:space="preserve">2. Software design</w:t>
       </w:r>
     </w:p>
-    <w:bookmarkStart w:id="26" w:name="software-architecture"/>
+    <w:bookmarkStart w:id="25" w:name="software-architecture"/>
     <w:p>
       <w:pPr>
         <w:pStyle w:val="Heading3"/>
@@ -578,20 +487,20 @@
       <w:r>
         <w:drawing>
           <wp:inline>
-            <wp:extent cx="5334000" cy="3318933"/>
+            <wp:extent cx="5753100" cy="3579706"/>
             <wp:effectExtent b="0" l="0" r="0" t="0"/>
-            <wp:docPr descr="Figure 1. Two input classes, one chain. The input class is determined from the data (detect_input_class), not declared by the user: an .e57 container carries pose and is reprojected; a single 2:1 image is taken over as is; several images without pose are stitched. For TLS input, the point cloud is added to the scene; inventory data derived from it with the repository scripts can be attached as georeferenced markers (dashed)." title="" id="24" name="Picture"/>
+            <wp:docPr descr="Figure 1. Two input classes, one chain. The input class is determined from the data (detect_input_class), not declared by the user: an .e57 container carries pose and is reprojected; a single 2:1 image is taken over as is; several images without pose are stitched. For TLS input, the point cloud is added to the scene; inventory data derived from it with the repository scripts can be attached as georeferenced markers (dashed)." title="" id="23" name="Picture"/>
             <a:graphic>
               <a:graphicData uri="http://schemas.openxmlformats.org/drawingml/2006/picture">
                 <pic:pic>
                   <pic:nvPicPr>
-                    <pic:cNvPr descr="figures/fig1_architektur.png" id="25" name="Picture"/>
+                    <pic:cNvPr descr="figures/fig1_architektur.png" id="24" name="Picture"/>
                     <pic:cNvPicPr>
                       <a:picLocks noChangeArrowheads="1" noChangeAspect="1"/>
                     </pic:cNvPicPr>
                   </pic:nvPicPr>
                   <pic:blipFill>
-                    <a:blip r:embed="rId23"/>
+                    <a:blip r:embed="rId22"/>
                     <a:stretch>
                       <a:fillRect/>
                     </a:stretch>
@@ -599,7 +508,7 @@
                   <pic:spPr bwMode="auto">
                     <a:xfrm>
                       <a:off x="0" y="0"/>
-                      <a:ext cx="5334000" cy="3318933"/>
+                      <a:ext cx="5753100" cy="3579706"/>
                     </a:xfrm>
                     <a:prstGeom prst="rect">
                       <a:avLst/>
@@ -760,8 +669,8 @@
         <w:t xml:space="preserve">A single image with another aspect ratio is rejected rather than guessed.</w:t>
       </w:r>
     </w:p>
-    <w:bookmarkEnd w:id="26"/>
-    <w:bookmarkStart w:id="27" w:name="functionality"/>
+    <w:bookmarkEnd w:id="25"/>
+    <w:bookmarkStart w:id="26" w:name="functionality"/>
     <w:p>
       <w:pPr>
         <w:pStyle w:val="Heading3"/>
@@ -774,7 +683,7 @@
       <w:pPr>
         <w:numPr>
           <w:ilvl w:val="0"/>
-          <w:numId w:val="1002"/>
+          <w:numId w:val="1001"/>
         </w:numPr>
         <w:pStyle w:val="Compact"/>
       </w:pPr>
@@ -859,7 +768,7 @@
       <w:pPr>
         <w:numPr>
           <w:ilvl w:val="0"/>
-          <w:numId w:val="1002"/>
+          <w:numId w:val="1001"/>
         </w:numPr>
         <w:pStyle w:val="Compact"/>
       </w:pPr>
@@ -893,7 +802,7 @@
       <w:pPr>
         <w:numPr>
           <w:ilvl w:val="0"/>
-          <w:numId w:val="1002"/>
+          <w:numId w:val="1001"/>
         </w:numPr>
         <w:pStyle w:val="Compact"/>
       </w:pPr>
@@ -912,7 +821,7 @@
       <w:pPr>
         <w:numPr>
           <w:ilvl w:val="0"/>
-          <w:numId w:val="1002"/>
+          <w:numId w:val="1001"/>
         </w:numPr>
         <w:pStyle w:val="Compact"/>
       </w:pPr>
@@ -924,13 +833,13 @@
         <w:t xml:space="preserve">Viewing</w:t>
       </w:r>
       <w:r>
-        <w:t xml:space="preserve">: panorama viewer (Pannellum [3]) and point-cloud viewer (three.js);</w:t>
-      </w:r>
-      <w:r>
-        <w:t xml:space="preserve"> </w:t>
-      </w:r>
-      <w:r>
-        <w:t xml:space="preserve">for very large clouds, dedicated streaming renderers such as Potree [4] remain</w:t>
+        <w:t xml:space="preserve">: panorama viewer (Pannellum; Petroff, 2019) and point-cloud viewer (three.js);</w:t>
+      </w:r>
+      <w:r>
+        <w:t xml:space="preserve"> </w:t>
+      </w:r>
+      <w:r>
+        <w:t xml:space="preserve">for very large clouds, dedicated streaming renderers such as Potree (Schütz, 2016) remain</w:t>
       </w:r>
       <w:r>
         <w:t xml:space="preserve"> </w:t>
@@ -943,7 +852,7 @@
       <w:pPr>
         <w:numPr>
           <w:ilvl w:val="0"/>
-          <w:numId w:val="1002"/>
+          <w:numId w:val="1001"/>
         </w:numPr>
         <w:pStyle w:val="Compact"/>
       </w:pPr>
@@ -968,7 +877,7 @@
       <w:pPr>
         <w:numPr>
           <w:ilvl w:val="0"/>
-          <w:numId w:val="1002"/>
+          <w:numId w:val="1001"/>
         </w:numPr>
         <w:pStyle w:val="Compact"/>
       </w:pPr>
@@ -983,24 +892,155 @@
         <w:t xml:space="preserve">: self-hosted (Caddy + Garage) or as a static export.</w:t>
       </w:r>
     </w:p>
+    <w:bookmarkEnd w:id="26"/>
     <w:bookmarkEnd w:id="27"/>
+    <w:bookmarkStart w:id="32" w:name="application-and-evaluation"/>
+    <w:p>
+      <w:pPr>
+        <w:pStyle w:val="Heading2"/>
+      </w:pPr>
+      <w:r>
+        <w:t xml:space="preserve">3. Application and evaluation</w:t>
+      </w:r>
+    </w:p>
+    <w:bookmarkStart w:id="28" w:name="Xc836ffea68b047d4e912a9e428b689ee52e571f"/>
+    <w:p>
+      <w:pPr>
+        <w:pStyle w:val="Heading3"/>
+      </w:pPr>
+      <w:r>
+        <w:t xml:space="preserve">3.1 Scanner RGB → walkable scene with inventory markers</w:t>
+      </w:r>
+    </w:p>
+    <w:p>
+      <w:pPr>
+        <w:pStyle w:val="FirstParagraph"/>
+      </w:pPr>
+      <w:r>
+        <w:t xml:space="preserve">A Leica BLK360 scan of the Renon forest plot (ICOS station IT-Ren, E57; Chang et al., 2025) with</w:t>
+      </w:r>
+      <w:r>
+        <w:t xml:space="preserve"> </w:t>
+      </w:r>
+      <w:r>
+        <w:t xml:space="preserve">six pinhole images and poses per setup is reprojected to a seamless</w:t>
+      </w:r>
+      <w:r>
+        <w:t xml:space="preserve"> </w:t>
+      </w:r>
+      <w:r>
+        <w:t xml:space="preserve">equirectangular panorama; the co-registered point cloud is added, and</w:t>
+      </w:r>
+      <w:r>
+        <w:t xml:space="preserve"> </w:t>
+      </w:r>
+      <w:r>
+        <w:t xml:space="preserve">tree-inventory markers computed with the repository scripts (stem position, DBH,</w:t>
+      </w:r>
+      <w:r>
+        <w:t xml:space="preserve"> </w:t>
+      </w:r>
+      <w:r>
+        <w:t xml:space="preserve">height, crown metrics, growth projection) are placed in the walkable scene. One</w:t>
+      </w:r>
+      <w:r>
+        <w:t xml:space="preserve"> </w:t>
+      </w:r>
+      <w:r>
+        <w:t xml:space="preserve">acquisition thus yields both a visual record and a data carrier.</w:t>
+      </w:r>
+    </w:p>
+    <w:p>
+      <w:pPr>
+        <w:pStyle w:val="BodyText"/>
+      </w:pPr>
+      <w:r>
+        <w:t xml:space="preserve">The markers are only as reliable as the scan geometry behind them. For plot-wide</w:t>
+      </w:r>
+      <w:r>
+        <w:t xml:space="preserve"> </w:t>
+      </w:r>
+      <w:r>
+        <w:t xml:space="preserve">TLS clouds the inventory scripts use 3DFin (Laino et al., 2024) as stem detector. On two manually</w:t>
+      </w:r>
+      <w:r>
+        <w:t xml:space="preserve"> </w:t>
+      </w:r>
+      <w:r>
+        <w:t xml:space="preserve">labelled plots of the SegmentedForests dataset (Laino et al., 2026) it reaches 98.5 % recall /</w:t>
+      </w:r>
+      <w:r>
+        <w:t xml:space="preserve"> </w:t>
+      </w:r>
+      <w:r>
+        <w:t xml:space="preserve">95.7 % precision (plot_06, 68 stems) and 94.5 % / 100 % (plot_07, 128 stems). This</w:t>
+      </w:r>
+      <w:r>
+        <w:t xml:space="preserve"> </w:t>
+      </w:r>
+      <w:r>
+        <w:t xml:space="preserve">accuracy depends on circumferential stem coverage: 3DFin accepts a diameter only if</w:t>
+      </w:r>
+      <w:r>
+        <w:t xml:space="preserve"> </w:t>
+      </w:r>
+      <w:r>
+        <w:t xml:space="preserve">the stem cross-section at breast height is covered in at least 9 of 16 sectors</w:t>
+      </w:r>
+      <w:r>
+        <w:t xml:space="preserve"> </w:t>
+      </w:r>
+      <w:r>
+        <w:t xml:space="preserve">(≈ 202°). The labelled plots offer a median arc of 280–360°; on the Renon stand,</w:t>
+      </w:r>
+      <w:r>
+        <w:t xml:space="preserve"> </w:t>
+      </w:r>
+      <w:r>
+        <w:t xml:space="preserve">merged from four nearby scan positions, the median is 180°, and 3DFin declines a</w:t>
+      </w:r>
+      <w:r>
+        <w:t xml:space="preserve"> </w:t>
+      </w:r>
+      <w:r>
+        <w:t xml:space="preserve">diameter for 29 of 37 detected stems — correct behaviour, since the data do not</w:t>
+      </w:r>
+      <w:r>
+        <w:t xml:space="preserve"> </w:t>
+      </w:r>
+      <w:r>
+        <w:t xml:space="preserve">support one. A systematic comparison of detectors as a function of coverage is</w:t>
+      </w:r>
+      <w:r>
+        <w:t xml:space="preserve"> </w:t>
+      </w:r>
+      <w:r>
+        <w:t xml:space="preserve">beyond the scope of this paper; per-method results are documented in the</w:t>
+      </w:r>
+      <w:r>
+        <w:t xml:space="preserve"> </w:t>
+      </w:r>
+      <w:r>
+        <w:t xml:space="preserve">repository (</w:t>
+      </w:r>
+      <w:r>
+        <w:rPr>
+          <w:rStyle w:val="VerbatimChar"/>
+        </w:rPr>
+        <w:t xml:space="preserve">scripts/BENCH_DETECTION.md</w:t>
+      </w:r>
+      <w:r>
+        <w:t xml:space="preserve">).</w:t>
+      </w:r>
+    </w:p>
     <w:bookmarkEnd w:id="28"/>
-    <w:bookmarkStart w:id="33" w:name="application-and-evaluation"/>
-    <w:p>
-      <w:pPr>
-        <w:pStyle w:val="Heading2"/>
-      </w:pPr>
-      <w:r>
-        <w:t xml:space="preserve">3. Application and evaluation</w:t>
-      </w:r>
-    </w:p>
-    <w:bookmarkStart w:id="29" w:name="Xc836ffea68b047d4e912a9e428b689ee52e571f"/>
+    <w:bookmarkStart w:id="29" w:name="X3757c52ac33f1a37ce4ac431c34e63bf6fa7ede"/>
     <w:p>
       <w:pPr>
         <w:pStyle w:val="Heading3"/>
       </w:pPr>
       <w:r>
-        <w:t xml:space="preserve">3.1 Scanner RGB → walkable scene with inventory markers</w:t>
+        <w:t xml:space="preserve">3.2 Panorama quality against CC0 ground truth</w:t>
       </w:r>
     </w:p>
     <w:p>
@@ -1008,137 +1048,6 @@
         <w:pStyle w:val="FirstParagraph"/>
       </w:pPr>
       <w:r>
-        <w:t xml:space="preserve">A Leica BLK360 scan of the Renon forest plot (ICOS station IT-Ren, E57 [15]) with</w:t>
-      </w:r>
-      <w:r>
-        <w:t xml:space="preserve"> </w:t>
-      </w:r>
-      <w:r>
-        <w:t xml:space="preserve">six pinhole images and poses per setup is reprojected to a seamless</w:t>
-      </w:r>
-      <w:r>
-        <w:t xml:space="preserve"> </w:t>
-      </w:r>
-      <w:r>
-        <w:t xml:space="preserve">equirectangular panorama; the co-registered point cloud is added, and</w:t>
-      </w:r>
-      <w:r>
-        <w:t xml:space="preserve"> </w:t>
-      </w:r>
-      <w:r>
-        <w:t xml:space="preserve">tree-inventory markers computed with the repository scripts (stem position, DBH,</w:t>
-      </w:r>
-      <w:r>
-        <w:t xml:space="preserve"> </w:t>
-      </w:r>
-      <w:r>
-        <w:t xml:space="preserve">height, crown metrics, growth projection) are placed in the walkable scene. One</w:t>
-      </w:r>
-      <w:r>
-        <w:t xml:space="preserve"> </w:t>
-      </w:r>
-      <w:r>
-        <w:t xml:space="preserve">acquisition thus yields both a visual record and a data carrier.</w:t>
-      </w:r>
-    </w:p>
-    <w:p>
-      <w:pPr>
-        <w:pStyle w:val="BodyText"/>
-      </w:pPr>
-      <w:r>
-        <w:t xml:space="preserve">The markers are only as reliable as the scan geometry behind them. For plot-wide</w:t>
-      </w:r>
-      <w:r>
-        <w:t xml:space="preserve"> </w:t>
-      </w:r>
-      <w:r>
-        <w:t xml:space="preserve">TLS clouds the inventory scripts use 3DFin [11] as stem detector. On two manually</w:t>
-      </w:r>
-      <w:r>
-        <w:t xml:space="preserve"> </w:t>
-      </w:r>
-      <w:r>
-        <w:t xml:space="preserve">labelled plots of the SegmentedForests dataset [12] it reaches 98.5 % recall /</w:t>
-      </w:r>
-      <w:r>
-        <w:t xml:space="preserve"> </w:t>
-      </w:r>
-      <w:r>
-        <w:t xml:space="preserve">95.7 % precision (plot_06, 68 stems) and 94.5 % / 100 % (plot_07, 128 stems). This</w:t>
-      </w:r>
-      <w:r>
-        <w:t xml:space="preserve"> </w:t>
-      </w:r>
-      <w:r>
-        <w:t xml:space="preserve">accuracy depends on circumferential stem coverage: 3DFin accepts a diameter only if</w:t>
-      </w:r>
-      <w:r>
-        <w:t xml:space="preserve"> </w:t>
-      </w:r>
-      <w:r>
-        <w:t xml:space="preserve">the stem cross-section at breast height is covered in at least 9 of 16 sectors</w:t>
-      </w:r>
-      <w:r>
-        <w:t xml:space="preserve"> </w:t>
-      </w:r>
-      <w:r>
-        <w:t xml:space="preserve">(≈ 202°). The labelled plots offer a median arc of 280–360°; on the Renon stand,</w:t>
-      </w:r>
-      <w:r>
-        <w:t xml:space="preserve"> </w:t>
-      </w:r>
-      <w:r>
-        <w:t xml:space="preserve">merged from four nearby scan positions, the median is 180°, and 3DFin declines a</w:t>
-      </w:r>
-      <w:r>
-        <w:t xml:space="preserve"> </w:t>
-      </w:r>
-      <w:r>
-        <w:t xml:space="preserve">diameter for 29 of 37 detected stems — correct behaviour, since the data do not</w:t>
-      </w:r>
-      <w:r>
-        <w:t xml:space="preserve"> </w:t>
-      </w:r>
-      <w:r>
-        <w:t xml:space="preserve">support one. A systematic comparison of detectors as a function of coverage is</w:t>
-      </w:r>
-      <w:r>
-        <w:t xml:space="preserve"> </w:t>
-      </w:r>
-      <w:r>
-        <w:t xml:space="preserve">beyond the scope of this paper; per-method results are documented in the</w:t>
-      </w:r>
-      <w:r>
-        <w:t xml:space="preserve"> </w:t>
-      </w:r>
-      <w:r>
-        <w:t xml:space="preserve">repository (</w:t>
-      </w:r>
-      <w:r>
-        <w:rPr>
-          <w:rStyle w:val="VerbatimChar"/>
-        </w:rPr>
-        <w:t xml:space="preserve">scripts/BENCH_DETECTION.md</w:t>
-      </w:r>
-      <w:r>
-        <w:t xml:space="preserve">).</w:t>
-      </w:r>
-    </w:p>
-    <w:bookmarkEnd w:id="29"/>
-    <w:bookmarkStart w:id="30" w:name="X3757c52ac33f1a37ce4ac431c34e63bf6fa7ede"/>
-    <w:p>
-      <w:pPr>
-        <w:pStyle w:val="Heading3"/>
-      </w:pPr>
-      <w:r>
-        <w:t xml:space="preserve">3.2 Panorama quality against CC0 ground truth</w:t>
-      </w:r>
-    </w:p>
-    <w:p>
-      <w:pPr>
-        <w:pStyle w:val="FirstParagraph"/>
-      </w:pPr>
-      <w:r>
         <w:t xml:space="preserve">From each of eleven CC0 reference panoramas (Poly Haven, 8192×4096) we render</w:t>
       </w:r>
       <w:r>
@@ -1163,7 +1072,7 @@
         <w:t xml:space="preserve"> </w:t>
       </w:r>
       <w:r>
-        <w:t xml:space="preserve">SSIM [8]). A run counts as</w:t>
+        <w:t xml:space="preserve">SSIM; Wang et al., 2004). A run counts as</w:t>
       </w:r>
       <w:r>
         <w:t xml:space="preserve"> </w:t>
@@ -1564,7 +1473,7 @@
         <w:t xml:space="preserve"> </w:t>
       </w:r>
       <w:r>
-        <w:t xml:space="preserve">correlation [9] (64-px blocks, 50 % overlap, low-structure blocks discarded).</w:t>
+        <w:t xml:space="preserve">correlation (Kuglin and Hines, 1975) with 64-px blocks, 50 % overlap, and low-structure blocks discarded.</w:t>
       </w:r>
       <w:r>
         <w:t xml:space="preserve"> </w:t>
@@ -1611,8 +1520,8 @@
         <w:t xml:space="preserve">meaningful only in the comparison of the two branches.</w:t>
       </w:r>
     </w:p>
-    <w:bookmarkEnd w:id="30"/>
-    <w:bookmarkStart w:id="31" w:name="real-captures-the-cost-of-parallax"/>
+    <w:bookmarkEnd w:id="29"/>
+    <w:bookmarkStart w:id="30" w:name="real-captures-the-cost-of-parallax"/>
     <w:p>
       <w:pPr>
         <w:pStyle w:val="Heading3"/>
@@ -1711,7 +1620,7 @@
         <w:t xml:space="preserve"> </w:t>
       </w:r>
       <w:r>
-        <w:t xml:space="preserve">[10]: 72 photographs from a rotating</w:t>
+        <w:t xml:space="preserve">(Meneghetti et al., 2015): 72 photographs from a rotating</w:t>
       </w:r>
       <w:r>
         <w:t xml:space="preserve"> </w:t>
@@ -2004,8 +1913,8 @@
         <w:t xml:space="preserve">calibrated on real data.</w:t>
       </w:r>
     </w:p>
-    <w:bookmarkEnd w:id="31"/>
-    <w:bookmarkStart w:id="32" w:name="runtime-per-input-class"/>
+    <w:bookmarkEnd w:id="30"/>
+    <w:bookmarkStart w:id="31" w:name="runtime-per-input-class"/>
     <w:p>
       <w:pPr>
         <w:pStyle w:val="Heading3"/>
@@ -2391,15 +2300,81 @@
         <w:t xml:space="preserve">avoids.</w:t>
       </w:r>
     </w:p>
+    <w:bookmarkEnd w:id="31"/>
     <w:bookmarkEnd w:id="32"/>
+    <w:bookmarkStart w:id="33" w:name="discussion"/>
+    <w:p>
+      <w:pPr>
+        <w:pStyle w:val="Heading2"/>
+      </w:pPr>
+      <w:r>
+        <w:t xml:space="preserve">4. Discussion</w:t>
+      </w:r>
+    </w:p>
+    <w:p>
+      <w:pPr>
+        <w:pStyle w:val="FirstParagraph"/>
+      </w:pPr>
+      <w:r>
+        <w:t xml:space="preserve">The tool makes reproducible, self-hosted 360°/3D documentation available without</w:t>
+      </w:r>
+      <w:r>
+        <w:t xml:space="preserve"> </w:t>
+      </w:r>
+      <w:r>
+        <w:t xml:space="preserve">vendor lock-in, from consumer cameras to TLS, through one GUI. It turns the</w:t>
+      </w:r>
+      <w:r>
+        <w:t xml:space="preserve"> </w:t>
+      </w:r>
+      <w:r>
+        <w:t xml:space="preserve">pose-bearing RGB images of laser scanners into navigable panoramas; the evaluation</w:t>
+      </w:r>
+      <w:r>
+        <w:t xml:space="preserve"> </w:t>
+      </w:r>
+      <w:r>
+        <w:t xml:space="preserve">shows why this is preferable whenever pose is available (no stitching failures,</w:t>
+      </w:r>
+      <w:r>
+        <w:t xml:space="preserve"> </w:t>
+      </w:r>
+      <w:r>
+        <w:t xml:space="preserve">higher accuracy, ~7× faster). For forest and environmental monitoring, one</w:t>
+      </w:r>
+      <w:r>
+        <w:t xml:space="preserve"> </w:t>
+      </w:r>
+      <w:r>
+        <w:t xml:space="preserve">acquisition yields a walkable panorama, the point cloud, and inventory markers in</w:t>
+      </w:r>
+      <w:r>
+        <w:t xml:space="preserve"> </w:t>
+      </w:r>
+      <w:r>
+        <w:t xml:space="preserve">the same scene, which supports communication and revisiting of plots. Seam offset</w:t>
+      </w:r>
+      <w:r>
+        <w:t xml:space="preserve"> </w:t>
+      </w:r>
+      <w:r>
+        <w:t xml:space="preserve">provides a candidate quality signal for automated batch processing, subject to</w:t>
+      </w:r>
+      <w:r>
+        <w:t xml:space="preserve"> </w:t>
+      </w:r>
+      <w:r>
+        <w:t xml:space="preserve">calibration on real captures.</w:t>
+      </w:r>
+    </w:p>
     <w:bookmarkEnd w:id="33"/>
-    <w:bookmarkStart w:id="34" w:name="discussion"/>
+    <w:bookmarkStart w:id="34" w:name="conclusions"/>
     <w:p>
       <w:pPr>
         <w:pStyle w:val="Heading2"/>
       </w:pPr>
       <w:r>
-        <w:t xml:space="preserve">4. Discussion</w:t>
+        <w:t xml:space="preserve">5. Conclusions</w:t>
       </w:r>
     </w:p>
     <w:p>
@@ -2407,131 +2382,65 @@
         <w:pStyle w:val="FirstParagraph"/>
       </w:pPr>
       <w:r>
-        <w:t xml:space="preserve">The tool makes reproducible, self-hosted 360°/3D documentation available without</w:t>
-      </w:r>
-      <w:r>
-        <w:t xml:space="preserve"> </w:t>
-      </w:r>
-      <w:r>
-        <w:t xml:space="preserve">vendor lock-in, from consumer cameras to TLS, through one GUI. It turns the</w:t>
-      </w:r>
-      <w:r>
-        <w:t xml:space="preserve"> </w:t>
-      </w:r>
-      <w:r>
-        <w:t xml:space="preserve">pose-bearing RGB images of laser scanners into navigable panoramas; the evaluation</w:t>
-      </w:r>
-      <w:r>
-        <w:t xml:space="preserve"> </w:t>
-      </w:r>
-      <w:r>
-        <w:t xml:space="preserve">shows why this is preferable whenever pose is available (no stitching failures,</w:t>
-      </w:r>
-      <w:r>
-        <w:t xml:space="preserve"> </w:t>
-      </w:r>
-      <w:r>
-        <w:t xml:space="preserve">higher accuracy, ~7× faster). For forest and environmental monitoring, one</w:t>
-      </w:r>
-      <w:r>
-        <w:t xml:space="preserve"> </w:t>
-      </w:r>
-      <w:r>
-        <w:t xml:space="preserve">acquisition yields a walkable panorama, the point cloud, and inventory markers in</w:t>
-      </w:r>
-      <w:r>
-        <w:t xml:space="preserve"> </w:t>
-      </w:r>
-      <w:r>
-        <w:t xml:space="preserve">the same scene, which supports communication and revisiting of plots. Seam offset</w:t>
-      </w:r>
-      <w:r>
-        <w:t xml:space="preserve"> </w:t>
-      </w:r>
-      <w:r>
-        <w:t xml:space="preserve">provides a candidate quality signal for automated batch processing, subject to</w:t>
-      </w:r>
-      <w:r>
-        <w:t xml:space="preserve"> </w:t>
-      </w:r>
-      <w:r>
-        <w:t xml:space="preserve">calibration on real captures.</w:t>
+        <w:t xml:space="preserve">We presented an open-source, containerized, GUI-driven chain that converts</w:t>
+      </w:r>
+      <w:r>
+        <w:t xml:space="preserve"> </w:t>
+      </w:r>
+      <w:r>
+        <w:t xml:space="preserve">multi-image captures — with or without known pose — into walkable web scenes,</w:t>
+      </w:r>
+      <w:r>
+        <w:t xml:space="preserve"> </w:t>
+      </w:r>
+      <w:r>
+        <w:t xml:space="preserve">self-hostable end to end. A ground-truth evaluation shows the pose-based</w:t>
+      </w:r>
+      <w:r>
+        <w:t xml:space="preserve"> </w:t>
+      </w:r>
+      <w:r>
+        <w:t xml:space="preserve">reprojection branch to be more accurate, more robust, and faster than stitching</w:t>
+      </w:r>
+      <w:r>
+        <w:t xml:space="preserve"> </w:t>
+      </w:r>
+      <w:r>
+        <w:t xml:space="preserve">when scanner poses are available; a reference-free measurement on real captures</w:t>
+      </w:r>
+      <w:r>
+        <w:t xml:space="preserve"> </w:t>
+      </w:r>
+      <w:r>
+        <w:t xml:space="preserve">quantifies how strongly parallax degrades stitching. Future work: calibrate the</w:t>
+      </w:r>
+      <w:r>
+        <w:t xml:space="preserve"> </w:t>
+      </w:r>
+      <w:r>
+        <w:t xml:space="preserve">seam-offset quality flag on real captures and integrate it into the GUI; add a</w:t>
+      </w:r>
+      <w:r>
+        <w:t xml:space="preserve"> </w:t>
+      </w:r>
+      <w:r>
+        <w:t xml:space="preserve">freely licensed set of raw dual-fisheye frames from a consumer 360° camera to the</w:t>
+      </w:r>
+      <w:r>
+        <w:t xml:space="preserve"> </w:t>
+      </w:r>
+      <w:r>
+        <w:t xml:space="preserve">evaluation; and run a usability study with non-expert users (System Usability</w:t>
+      </w:r>
+      <w:r>
+        <w:t xml:space="preserve"> </w:t>
+      </w:r>
+      <w:r>
+        <w:t xml:space="preserve">Scale; Brooke, 1996; Sauro and Lewis, 2016).</w:t>
       </w:r>
     </w:p>
     <w:bookmarkEnd w:id="34"/>
-    <w:bookmarkStart w:id="35" w:name="conclusions"/>
-    <w:p>
-      <w:pPr>
-        <w:pStyle w:val="Heading2"/>
-      </w:pPr>
-      <w:r>
-        <w:t xml:space="preserve">5. Conclusions</w:t>
-      </w:r>
-    </w:p>
-    <w:p>
-      <w:pPr>
-        <w:pStyle w:val="FirstParagraph"/>
-      </w:pPr>
-      <w:r>
-        <w:t xml:space="preserve">We presented an open-source, containerized, GUI-driven chain that converts</w:t>
-      </w:r>
-      <w:r>
-        <w:t xml:space="preserve"> </w:t>
-      </w:r>
-      <w:r>
-        <w:t xml:space="preserve">multi-image captures — with or without known pose — into walkable web scenes,</w:t>
-      </w:r>
-      <w:r>
-        <w:t xml:space="preserve"> </w:t>
-      </w:r>
-      <w:r>
-        <w:t xml:space="preserve">self-hostable end to end. A ground-truth evaluation shows the pose-based</w:t>
-      </w:r>
-      <w:r>
-        <w:t xml:space="preserve"> </w:t>
-      </w:r>
-      <w:r>
-        <w:t xml:space="preserve">reprojection branch to be more accurate, more robust, and faster than stitching</w:t>
-      </w:r>
-      <w:r>
-        <w:t xml:space="preserve"> </w:t>
-      </w:r>
-      <w:r>
-        <w:t xml:space="preserve">when scanner poses are available; a reference-free measurement on real captures</w:t>
-      </w:r>
-      <w:r>
-        <w:t xml:space="preserve"> </w:t>
-      </w:r>
-      <w:r>
-        <w:t xml:space="preserve">quantifies how strongly parallax degrades stitching. Future work: calibrate the</w:t>
-      </w:r>
-      <w:r>
-        <w:t xml:space="preserve"> </w:t>
-      </w:r>
-      <w:r>
-        <w:t xml:space="preserve">seam-offset quality flag on real captures and integrate it into the GUI; add a</w:t>
-      </w:r>
-      <w:r>
-        <w:t xml:space="preserve"> </w:t>
-      </w:r>
-      <w:r>
-        <w:t xml:space="preserve">freely licensed set of raw dual-fisheye frames from a consumer 360° camera to the</w:t>
-      </w:r>
-      <w:r>
-        <w:t xml:space="preserve"> </w:t>
-      </w:r>
-      <w:r>
-        <w:t xml:space="preserve">evaluation; and run a usability study with non-expert users (System Usability</w:t>
-      </w:r>
-      <w:r>
-        <w:t xml:space="preserve"> </w:t>
-      </w:r>
-      <w:r>
-        <w:t xml:space="preserve">Scale [13, 14]).</w:t>
-      </w:r>
-    </w:p>
-    <w:bookmarkEnd w:id="35"/>
-    <w:bookmarkStart w:id="36" w:name="code-availability"/>
+    <w:bookmarkStart w:id="35" w:name="code-availability"/>
     <w:p>
       <w:pPr>
         <w:pStyle w:val="Heading2"/>
@@ -2544,7 +2453,7 @@
       <w:pPr>
         <w:numPr>
           <w:ilvl w:val="0"/>
-          <w:numId w:val="1003"/>
+          <w:numId w:val="1002"/>
         </w:numPr>
         <w:pStyle w:val="Compact"/>
       </w:pPr>
@@ -2556,7 +2465,7 @@
       <w:pPr>
         <w:numPr>
           <w:ilvl w:val="0"/>
-          <w:numId w:val="1003"/>
+          <w:numId w:val="1002"/>
         </w:numPr>
         <w:pStyle w:val="Compact"/>
       </w:pPr>
@@ -2568,7 +2477,7 @@
       <w:pPr>
         <w:numPr>
           <w:ilvl w:val="0"/>
-          <w:numId w:val="1003"/>
+          <w:numId w:val="1002"/>
         </w:numPr>
         <w:pStyle w:val="Compact"/>
       </w:pPr>
@@ -2580,7 +2489,7 @@
       <w:pPr>
         <w:numPr>
           <w:ilvl w:val="0"/>
-          <w:numId w:val="1003"/>
+          <w:numId w:val="1002"/>
         </w:numPr>
         <w:pStyle w:val="Compact"/>
       </w:pPr>
@@ -2592,7 +2501,7 @@
       <w:pPr>
         <w:numPr>
           <w:ilvl w:val="0"/>
-          <w:numId w:val="1003"/>
+          <w:numId w:val="1002"/>
         </w:numPr>
         <w:pStyle w:val="Compact"/>
       </w:pPr>
@@ -2604,7 +2513,7 @@
       <w:pPr>
         <w:numPr>
           <w:ilvl w:val="0"/>
-          <w:numId w:val="1003"/>
+          <w:numId w:val="1002"/>
         </w:numPr>
         <w:pStyle w:val="Compact"/>
       </w:pPr>
@@ -2616,7 +2525,7 @@
       <w:pPr>
         <w:numPr>
           <w:ilvl w:val="0"/>
-          <w:numId w:val="1003"/>
+          <w:numId w:val="1002"/>
         </w:numPr>
         <w:pStyle w:val="Compact"/>
       </w:pPr>
@@ -2628,7 +2537,7 @@
       <w:pPr>
         <w:numPr>
           <w:ilvl w:val="0"/>
-          <w:numId w:val="1003"/>
+          <w:numId w:val="1002"/>
         </w:numPr>
         <w:pStyle w:val="Compact"/>
       </w:pPr>
@@ -2640,7 +2549,7 @@
       <w:pPr>
         <w:numPr>
           <w:ilvl w:val="0"/>
-          <w:numId w:val="1003"/>
+          <w:numId w:val="1002"/>
         </w:numPr>
         <w:pStyle w:val="Compact"/>
       </w:pPr>
@@ -2652,7 +2561,7 @@
       <w:pPr>
         <w:numPr>
           <w:ilvl w:val="0"/>
-          <w:numId w:val="1003"/>
+          <w:numId w:val="1002"/>
         </w:numPr>
         <w:pStyle w:val="Compact"/>
       </w:pPr>
@@ -2660,14 +2569,56 @@
         <w:t xml:space="preserve">Archived version (v1.0): https://doi.org/10.5281/zenodo.23323560</w:t>
       </w:r>
     </w:p>
+    <w:bookmarkEnd w:id="35"/>
+    <w:bookmarkStart w:id="36" w:name="data-availability"/>
+    <w:p>
+      <w:pPr>
+        <w:pStyle w:val="Heading2"/>
+      </w:pPr>
+      <w:r>
+        <w:t xml:space="preserve">Data availability</w:t>
+      </w:r>
+    </w:p>
+    <w:p>
+      <w:pPr>
+        <w:pStyle w:val="FirstParagraph"/>
+      </w:pPr>
+      <w:r>
+        <w:t xml:space="preserve">All data used in this work are third-party open data. Terrestrial laser scans:</w:t>
+      </w:r>
+      <w:r>
+        <w:t xml:space="preserve"> </w:t>
+      </w:r>
+      <w:r>
+        <w:t xml:space="preserve">Renon / ICOS IT-Ren (Leica BLK360, E57; CC BY 4.0; Chang et al., 2025) and SegmentedForests (MIT; Laino et al., 2026). Reference panoramas: eleven Poly Haven HDRIs (CC0,</w:t>
+      </w:r>
+      <w:r>
+        <w:t xml:space="preserve"> </w:t>
+      </w:r>
+      <w:r>
+        <w:t xml:space="preserve">https://polyhaven.com). Real multi-image capture: PASSTA LunchRoom (CC BY 4.0; Meneghetti et al., 2015). Source code, container recipe, and evaluation scripts:</w:t>
+      </w:r>
+      <w:r>
+        <w:t xml:space="preserve"> </w:t>
+      </w:r>
+      <w:r>
+        <w:t xml:space="preserve">https://github.com/anayana/For3Dsuite (GPL-3.0-or-later), archived at</w:t>
+      </w:r>
+      <w:r>
+        <w:t xml:space="preserve"> </w:t>
+      </w:r>
+      <w:r>
+        <w:t xml:space="preserve">https://doi.org/10.5281/zenodo.23323560.</w:t>
+      </w:r>
+    </w:p>
     <w:bookmarkEnd w:id="36"/>
-    <w:bookmarkStart w:id="37" w:name="data-availability"/>
+    <w:bookmarkStart w:id="37" w:name="declaration-of-competing-interest"/>
     <w:p>
       <w:pPr>
         <w:pStyle w:val="Heading2"/>
       </w:pPr>
       <w:r>
-        <w:t xml:space="preserve">Data availability</w:t>
+        <w:t xml:space="preserve">Declaration of competing interest</w:t>
       </w:r>
     </w:p>
     <w:p>
@@ -2675,77 +2626,23 @@
         <w:pStyle w:val="FirstParagraph"/>
       </w:pPr>
       <w:r>
-        <w:t xml:space="preserve">All data used in this work are third-party open data. Terrestrial laser scans:</w:t>
-      </w:r>
-      <w:r>
-        <w:t xml:space="preserve"> </w:t>
-      </w:r>
-      <w:r>
-        <w:t xml:space="preserve">Renon / ICOS IT-Ren (Leica BLK360, E57; CC BY 4.0) [15] and SegmentedForests</w:t>
-      </w:r>
-      <w:r>
-        <w:t xml:space="preserve"> </w:t>
-      </w:r>
-      <w:r>
-        <w:t xml:space="preserve">(MIT) [12]. Reference panoramas: eleven Poly Haven HDRIs (CC0,</w:t>
-      </w:r>
-      <w:r>
-        <w:t xml:space="preserve"> </w:t>
-      </w:r>
-      <w:r>
-        <w:t xml:space="preserve">https://polyhaven.com). Real multi-image capture: PASSTA LunchRoom (CC BY 4.0)</w:t>
-      </w:r>
-      <w:r>
-        <w:t xml:space="preserve"> </w:t>
-      </w:r>
-      <w:r>
-        <w:t xml:space="preserve">[10]. Source code, container recipe, and evaluation scripts:</w:t>
-      </w:r>
-      <w:r>
-        <w:t xml:space="preserve"> </w:t>
-      </w:r>
-      <w:r>
-        <w:t xml:space="preserve">https://github.com/anayana/For3Dsuite (GPL-3.0-or-later), archived at</w:t>
-      </w:r>
-      <w:r>
-        <w:t xml:space="preserve"> </w:t>
-      </w:r>
-      <w:r>
-        <w:t xml:space="preserve">https://doi.org/10.5281/zenodo.23323560.</w:t>
+        <w:t xml:space="preserve">The author declares no known competing financial interests or personal</w:t>
+      </w:r>
+      <w:r>
+        <w:t xml:space="preserve"> </w:t>
+      </w:r>
+      <w:r>
+        <w:t xml:space="preserve">relationships that could have appeared to influence the work reported in this</w:t>
+      </w:r>
+      <w:r>
+        <w:t xml:space="preserve"> </w:t>
+      </w:r>
+      <w:r>
+        <w:t xml:space="preserve">paper.</w:t>
       </w:r>
     </w:p>
     <w:bookmarkEnd w:id="37"/>
-    <w:bookmarkStart w:id="38" w:name="declaration-of-competing-interest"/>
-    <w:p>
-      <w:pPr>
-        <w:pStyle w:val="Heading2"/>
-      </w:pPr>
-      <w:r>
-        <w:t xml:space="preserve">Declaration of competing interest</w:t>
-      </w:r>
-    </w:p>
-    <w:p>
-      <w:pPr>
-        <w:pStyle w:val="FirstParagraph"/>
-      </w:pPr>
-      <w:r>
-        <w:t xml:space="preserve">The author declares no known competing financial interests or personal</w:t>
-      </w:r>
-      <w:r>
-        <w:t xml:space="preserve"> </w:t>
-      </w:r>
-      <w:r>
-        <w:t xml:space="preserve">relationships that could have appeared to influence the work reported in this</w:t>
-      </w:r>
-      <w:r>
-        <w:t xml:space="preserve"> </w:t>
-      </w:r>
-      <w:r>
-        <w:t xml:space="preserve">paper.</w:t>
-      </w:r>
-    </w:p>
-    <w:bookmarkEnd w:id="38"/>
-    <w:bookmarkStart w:id="39" w:name="credit-authorship-contribution-statement"/>
+    <w:bookmarkStart w:id="38" w:name="credit-authorship-contribution-statement"/>
     <w:p>
       <w:pPr>
         <w:pStyle w:val="Heading2"/>
@@ -2784,14 +2681,56 @@
         <w:t xml:space="preserve">review &amp; editing.</w:t>
       </w:r>
     </w:p>
+    <w:bookmarkEnd w:id="38"/>
+    <w:bookmarkStart w:id="39" w:name="acknowledgements"/>
+    <w:p>
+      <w:pPr>
+        <w:pStyle w:val="Heading2"/>
+      </w:pPr>
+      <w:r>
+        <w:t xml:space="preserve">Acknowledgements</w:t>
+      </w:r>
+    </w:p>
+    <w:p>
+      <w:pPr>
+        <w:pStyle w:val="FirstParagraph"/>
+      </w:pPr>
+      <w:r>
+        <w:t xml:space="preserve">The author thanks the providers of the open datasets used here: Chang et al. and</w:t>
+      </w:r>
+      <w:r>
+        <w:t xml:space="preserve"> </w:t>
+      </w:r>
+      <w:r>
+        <w:t xml:space="preserve">the ICOS ecosystem station IT-Ren for the Renon laser scans, the authors of</w:t>
+      </w:r>
+      <w:r>
+        <w:t xml:space="preserve"> </w:t>
+      </w:r>
+      <w:r>
+        <w:t xml:space="preserve">SegmentedForests and PASSTA, and the Poly Haven contributors. This research</w:t>
+      </w:r>
+      <w:r>
+        <w:t xml:space="preserve"> </w:t>
+      </w:r>
+      <w:r>
+        <w:t xml:space="preserve">received no specific grant from any funding agency in the public, commercial, or</w:t>
+      </w:r>
+      <w:r>
+        <w:t xml:space="preserve"> </w:t>
+      </w:r>
+      <w:r>
+        <w:t xml:space="preserve">not-for-profit sectors.</w:t>
+      </w:r>
+    </w:p>
     <w:bookmarkEnd w:id="39"/>
-    <w:bookmarkStart w:id="40" w:name="acknowledgements"/>
+    <w:bookmarkStart w:id="40" w:name="references"/>
     <w:p>
       <w:pPr>
         <w:pStyle w:val="Heading2"/>
       </w:pPr>
       <w:r>
-        <w:t xml:space="preserve">Acknowledgements</w:t>
+        <w:t xml:space="preserve">References</w:t>
       </w:r>
     </w:p>
     <w:p>
@@ -2799,55 +2738,25 @@
         <w:pStyle w:val="FirstParagraph"/>
       </w:pPr>
       <w:r>
-        <w:t xml:space="preserve">The author thanks the providers of the open datasets used here: Chang et al. and</w:t>
-      </w:r>
-      <w:r>
-        <w:t xml:space="preserve"> </w:t>
-      </w:r>
-      <w:r>
-        <w:t xml:space="preserve">the ICOS ecosystem station IT-Ren for the Renon laser scans, the authors of</w:t>
-      </w:r>
-      <w:r>
-        <w:t xml:space="preserve"> </w:t>
-      </w:r>
-      <w:r>
-        <w:t xml:space="preserve">SegmentedForests and PASSTA, and the Poly Haven contributors. This research</w:t>
-      </w:r>
-      <w:r>
-        <w:t xml:space="preserve"> </w:t>
-      </w:r>
-      <w:r>
-        <w:t xml:space="preserve">received no specific grant from any funding agency in the public, commercial, or</w:t>
-      </w:r>
-      <w:r>
-        <w:t xml:space="preserve"> </w:t>
-      </w:r>
-      <w:r>
-        <w:t xml:space="preserve">not-for-profit sectors.</w:t>
-      </w:r>
-    </w:p>
-    <w:bookmarkEnd w:id="40"/>
-    <w:bookmarkStart w:id="41" w:name="references"/>
-    <w:p>
-      <w:pPr>
-        <w:pStyle w:val="Heading2"/>
-      </w:pPr>
-      <w:r>
-        <w:t xml:space="preserve">References</w:t>
-      </w:r>
-    </w:p>
-    <w:p>
-      <w:pPr>
-        <w:pStyle w:val="FirstParagraph"/>
-      </w:pPr>
-      <w:r>
-        <w:t xml:space="preserve">[1] Brown, M., Lowe, D. G. (2007). Automatic panoramic image stitching using</w:t>
-      </w:r>
-      <w:r>
-        <w:t xml:space="preserve"> </w:t>
-      </w:r>
-      <w:r>
-        <w:t xml:space="preserve">invariant features.</w:t>
+        <w:t xml:space="preserve">Brooke, J. (1996). SUS: a</w:t>
+      </w:r>
+      <w:r>
+        <w:t xml:space="preserve"> </w:t>
+      </w:r>
+      <w:r>
+        <w:t xml:space="preserve">“</w:t>
+      </w:r>
+      <w:r>
+        <w:t xml:space="preserve">quick and dirty</w:t>
+      </w:r>
+      <w:r>
+        <w:t xml:space="preserve">”</w:t>
+      </w:r>
+      <w:r>
+        <w:t xml:space="preserve"> </w:t>
+      </w:r>
+      <w:r>
+        <w:t xml:space="preserve">usability scale. In:</w:t>
       </w:r>
       <w:r>
         <w:t xml:space="preserve"> </w:t>
@@ -2857,43 +2766,40 @@
           <w:iCs/>
           <w:i/>
         </w:rPr>
-        <w:t xml:space="preserve">International Journal of Computer Vision</w:t>
-      </w:r>
-      <w:r>
-        <w:t xml:space="preserve"> </w:t>
-      </w:r>
-      <w:r>
-        <w:t xml:space="preserve">74(1), 59–73.</w:t>
-      </w:r>
-      <w:r>
-        <w:t xml:space="preserve"> </w:t>
-      </w:r>
-      <w:r>
-        <w:t xml:space="preserve">https://doi.org/10.1007/s11263-006-0002-3</w:t>
-      </w:r>
-    </w:p>
-    <w:p>
-      <w:pPr>
-        <w:pStyle w:val="BodyText"/>
-      </w:pPr>
-      <w:r>
-        <w:t xml:space="preserve">[2] Szeliski, R. (2006). Image alignment and stitching: a tutorial.</w:t>
-      </w:r>
-      <w:r>
-        <w:t xml:space="preserve"> </w:t>
+        <w:t xml:space="preserve">Usability</w:t>
       </w:r>
       <w:r>
         <w:rPr>
           <w:iCs/>
           <w:i/>
         </w:rPr>
-        <w:t xml:space="preserve">Foundations</w:t>
+        <w:t xml:space="preserve"> </w:t>
       </w:r>
       <w:r>
         <w:rPr>
           <w:iCs/>
           <w:i/>
         </w:rPr>
+        <w:t xml:space="preserve">Evaluation in Industry</w:t>
+      </w:r>
+      <w:r>
+        <w:t xml:space="preserve">, Taylor &amp; Francis, 189–194.</w:t>
+      </w:r>
+    </w:p>
+    <w:p>
+      <w:pPr>
+        <w:pStyle w:val="BodyText"/>
+      </w:pPr>
+      <w:r>
+        <w:t xml:space="preserve">Brown, M., Lowe, D. G. (2007). Automatic panoramic image stitching using</w:t>
+      </w:r>
+      <w:r>
+        <w:t xml:space="preserve"> </w:t>
+      </w:r>
+      <w:r>
+        <w:t xml:space="preserve">invariant features.</w:t>
+      </w:r>
+      <w:r>
         <w:t xml:space="preserve"> </w:t>
       </w:r>
       <w:r>
@@ -2901,19 +2807,19 @@
           <w:iCs/>
           <w:i/>
         </w:rPr>
-        <w:t xml:space="preserve">and Trends in Computer Graphics and Vision</w:t>
-      </w:r>
-      <w:r>
-        <w:t xml:space="preserve"> </w:t>
-      </w:r>
-      <w:r>
-        <w:t xml:space="preserve">2(1), 1–104.</w:t>
-      </w:r>
-      <w:r>
-        <w:t xml:space="preserve"> </w:t>
-      </w:r>
-      <w:r>
-        <w:t xml:space="preserve">https://doi.org/10.1561/0600000009</w:t>
+        <w:t xml:space="preserve">International Journal of Computer Vision</w:t>
+      </w:r>
+      <w:r>
+        <w:t xml:space="preserve"> </w:t>
+      </w:r>
+      <w:r>
+        <w:t xml:space="preserve">74(1), 59–73.</w:t>
+      </w:r>
+      <w:r>
+        <w:t xml:space="preserve"> </w:t>
+      </w:r>
+      <w:r>
+        <w:t xml:space="preserve">https://doi.org/10.1007/s11263-006-0002-3</w:t>
       </w:r>
     </w:p>
     <w:p>
@@ -2921,7 +2827,63 @@
         <w:pStyle w:val="BodyText"/>
       </w:pPr>
       <w:r>
-        <w:t xml:space="preserve">[3] Petroff, M. A. (2019). Pannellum: a lightweight web-based panorama viewer.</w:t>
+        <w:t xml:space="preserve">Chang, M., Candotti, A., von Ellenrieder, K., Tomelleri, E., Camurri, M.</w:t>
+      </w:r>
+      <w:r>
+        <w:t xml:space="preserve"> </w:t>
+      </w:r>
+      <w:r>
+        <w:t xml:space="preserve">(2025). Data for:</w:t>
+      </w:r>
+      <w:r>
+        <w:t xml:space="preserve"> </w:t>
+      </w:r>
+      <w:r>
+        <w:t xml:space="preserve">“</w:t>
+      </w:r>
+      <w:r>
+        <w:t xml:space="preserve">A multi-platform LiDAR dataset for standardized forest</w:t>
+      </w:r>
+      <w:r>
+        <w:t xml:space="preserve"> </w:t>
+      </w:r>
+      <w:r>
+        <w:t xml:space="preserve">inventory measurement at long term ecological monitoring sites</w:t>
+      </w:r>
+      <w:r>
+        <w:t xml:space="preserve">”</w:t>
+      </w:r>
+      <w:r>
+        <w:t xml:space="preserve"> </w:t>
+      </w:r>
+      <w:r>
+        <w:t xml:space="preserve">[Dataset].</w:t>
+      </w:r>
+      <w:r>
+        <w:t xml:space="preserve"> </w:t>
+      </w:r>
+      <w:r>
+        <w:t xml:space="preserve">Zenodo. https://doi.org/10.5281/zenodo.17186174</w:t>
+      </w:r>
+    </w:p>
+    <w:p>
+      <w:pPr>
+        <w:pStyle w:val="BodyText"/>
+      </w:pPr>
+      <w:r>
+        <w:t xml:space="preserve">Houshiar, H., Elseberg, J., Borrmann, D., Nüchter, A. (2015). A study of</w:t>
+      </w:r>
+      <w:r>
+        <w:t xml:space="preserve"> </w:t>
+      </w:r>
+      <w:r>
+        <w:t xml:space="preserve">projections for key point based registration of panoramic terrestrial 3D laser</w:t>
+      </w:r>
+      <w:r>
+        <w:t xml:space="preserve"> </w:t>
+      </w:r>
+      <w:r>
+        <w:t xml:space="preserve">scan.</w:t>
       </w:r>
       <w:r>
         <w:t xml:space="preserve"> </w:t>
@@ -2931,19 +2893,19 @@
           <w:iCs/>
           <w:i/>
         </w:rPr>
-        <w:t xml:space="preserve">Journal of Open Source Software</w:t>
-      </w:r>
-      <w:r>
-        <w:t xml:space="preserve"> </w:t>
-      </w:r>
-      <w:r>
-        <w:t xml:space="preserve">4(40), 1628.</w:t>
-      </w:r>
-      <w:r>
-        <w:t xml:space="preserve"> </w:t>
-      </w:r>
-      <w:r>
-        <w:t xml:space="preserve">https://doi.org/10.21105/joss.01628</w:t>
+        <w:t xml:space="preserve">Geo-spatial Information Science</w:t>
+      </w:r>
+      <w:r>
+        <w:t xml:space="preserve"> </w:t>
+      </w:r>
+      <w:r>
+        <w:t xml:space="preserve">18(1), 11–31.</w:t>
+      </w:r>
+      <w:r>
+        <w:t xml:space="preserve"> </w:t>
+      </w:r>
+      <w:r>
+        <w:t xml:space="preserve">https://doi.org/10.1080/10095020.2015.1017913</w:t>
       </w:r>
     </w:p>
     <w:p>
@@ -2951,7 +2913,7 @@
         <w:pStyle w:val="BodyText"/>
       </w:pPr>
       <w:r>
-        <w:t xml:space="preserve">[4] Schütz, M. (2016).</w:t>
+        <w:t xml:space="preserve">Huber, D. (2011). The ASTM E57 file format for 3D imaging data exchange.</w:t>
       </w:r>
       <w:r>
         <w:t xml:space="preserve"> </w:t>
@@ -2961,13 +2923,19 @@
           <w:iCs/>
           <w:i/>
         </w:rPr>
-        <w:t xml:space="preserve">Potree: Rendering large point clouds in web browsers.</w:t>
-      </w:r>
-      <w:r>
-        <w:t xml:space="preserve"> </w:t>
-      </w:r>
-      <w:r>
-        <w:t xml:space="preserve">Diploma thesis, TU Wien.</w:t>
+        <w:t xml:space="preserve">Proc. SPIE</w:t>
+      </w:r>
+      <w:r>
+        <w:t xml:space="preserve"> </w:t>
+      </w:r>
+      <w:r>
+        <w:t xml:space="preserve">7864, Three-Dimensional Imaging, Interaction, and Measurement,</w:t>
+      </w:r>
+      <w:r>
+        <w:t xml:space="preserve"> </w:t>
+      </w:r>
+      <w:r>
+        <w:t xml:space="preserve">78640A. https://doi.org/10.1117/12.876555</w:t>
       </w:r>
     </w:p>
     <w:p>
@@ -2975,7 +2943,13 @@
         <w:pStyle w:val="BodyText"/>
       </w:pPr>
       <w:r>
-        <w:t xml:space="preserve">[5] Huber, D. (2011). The ASTM E57 file format for 3D imaging data exchange.</w:t>
+        <w:t xml:space="preserve">Kang, Z., et al. (2009). Automatic registration of terrestrial laser scanning</w:t>
+      </w:r>
+      <w:r>
+        <w:t xml:space="preserve"> </w:t>
+      </w:r>
+      <w:r>
+        <w:t xml:space="preserve">point clouds using panoramic reflectance images.</w:t>
       </w:r>
       <w:r>
         <w:t xml:space="preserve"> </w:t>
@@ -2985,19 +2959,19 @@
           <w:iCs/>
           <w:i/>
         </w:rPr>
-        <w:t xml:space="preserve">Proc. SPIE</w:t>
-      </w:r>
-      <w:r>
-        <w:t xml:space="preserve"> </w:t>
-      </w:r>
-      <w:r>
-        <w:t xml:space="preserve">7864, Three-Dimensional Imaging, Interaction, and Measurement,</w:t>
-      </w:r>
-      <w:r>
-        <w:t xml:space="preserve"> </w:t>
-      </w:r>
-      <w:r>
-        <w:t xml:space="preserve">78640A. https://doi.org/10.1117/12.876555</w:t>
+        <w:t xml:space="preserve">Sensors</w:t>
+      </w:r>
+      <w:r>
+        <w:t xml:space="preserve"> </w:t>
+      </w:r>
+      <w:r>
+        <w:t xml:space="preserve">9(4), 2621–2646.</w:t>
+      </w:r>
+      <w:r>
+        <w:t xml:space="preserve"> </w:t>
+      </w:r>
+      <w:r>
+        <w:t xml:space="preserve">https://doi.org/10.3390/s90402621</w:t>
       </w:r>
     </w:p>
     <w:p>
@@ -3005,19 +2979,13 @@
         <w:pStyle w:val="BodyText"/>
       </w:pPr>
       <w:r>
-        <w:t xml:space="preserve">[6] Houshiar, H., Elseberg, J., Borrmann, D., Nüchter, A. (2015). A study of</w:t>
-      </w:r>
-      <w:r>
-        <w:t xml:space="preserve"> </w:t>
-      </w:r>
-      <w:r>
-        <w:t xml:space="preserve">projections for key point based registration of panoramic terrestrial 3D laser</w:t>
-      </w:r>
-      <w:r>
-        <w:t xml:space="preserve"> </w:t>
-      </w:r>
-      <w:r>
-        <w:t xml:space="preserve">scan.</w:t>
+        <w:t xml:space="preserve">Kuglin, C. D., Hines, D. C. (1975). The phase correlation image alignment</w:t>
+      </w:r>
+      <w:r>
+        <w:t xml:space="preserve"> </w:t>
+      </w:r>
+      <w:r>
+        <w:t xml:space="preserve">method.</w:t>
       </w:r>
       <w:r>
         <w:t xml:space="preserve"> </w:t>
@@ -3027,19 +2995,10 @@
           <w:iCs/>
           <w:i/>
         </w:rPr>
-        <w:t xml:space="preserve">Geo-spatial Information Science</w:t>
-      </w:r>
-      <w:r>
-        <w:t xml:space="preserve"> </w:t>
-      </w:r>
-      <w:r>
-        <w:t xml:space="preserve">18(1), 11–31.</w:t>
-      </w:r>
-      <w:r>
-        <w:t xml:space="preserve"> </w:t>
-      </w:r>
-      <w:r>
-        <w:t xml:space="preserve">https://doi.org/10.1080/10095020.2015.1017913</w:t>
+        <w:t xml:space="preserve">Proc. IEEE Int. Conf. on Cybernetics and Society</w:t>
+      </w:r>
+      <w:r>
+        <w:t xml:space="preserve">, 163–165.</w:t>
       </w:r>
     </w:p>
     <w:p>
@@ -3047,13 +3006,13 @@
         <w:pStyle w:val="BodyText"/>
       </w:pPr>
       <w:r>
-        <w:t xml:space="preserve">[7] Kang, Z., et al. (2009). Automatic registration of terrestrial laser scanning</w:t>
-      </w:r>
-      <w:r>
-        <w:t xml:space="preserve"> </w:t>
-      </w:r>
-      <w:r>
-        <w:t xml:space="preserve">point clouds using panoramic reflectance images.</w:t>
+        <w:t xml:space="preserve">Laino, D., Cabo, C., Prendes, C., et al. (2024). 3DFin: a software for</w:t>
+      </w:r>
+      <w:r>
+        <w:t xml:space="preserve"> </w:t>
+      </w:r>
+      <w:r>
+        <w:t xml:space="preserve">automated 3D forest inventories from terrestrial point clouds.</w:t>
       </w:r>
       <w:r>
         <w:t xml:space="preserve"> </w:t>
@@ -3063,19 +3022,19 @@
           <w:iCs/>
           <w:i/>
         </w:rPr>
-        <w:t xml:space="preserve">Sensors</w:t>
-      </w:r>
-      <w:r>
-        <w:t xml:space="preserve"> </w:t>
-      </w:r>
-      <w:r>
-        <w:t xml:space="preserve">9(4), 2621–2646.</w:t>
-      </w:r>
-      <w:r>
-        <w:t xml:space="preserve"> </w:t>
-      </w:r>
-      <w:r>
-        <w:t xml:space="preserve">https://doi.org/10.3390/s90402621</w:t>
+        <w:t xml:space="preserve">Forestry</w:t>
+      </w:r>
+      <w:r>
+        <w:t xml:space="preserve"> </w:t>
+      </w:r>
+      <w:r>
+        <w:t xml:space="preserve">97(4),</w:t>
+      </w:r>
+      <w:r>
+        <w:t xml:space="preserve"> </w:t>
+      </w:r>
+      <w:r>
+        <w:t xml:space="preserve">479–496. https://doi.org/10.1093/forestry/cpae020</w:t>
       </w:r>
     </w:p>
     <w:p>
@@ -3083,13 +3042,13 @@
         <w:pStyle w:val="BodyText"/>
       </w:pPr>
       <w:r>
-        <w:t xml:space="preserve">[8] Wang, Z., Bovik, A. C., Sheikh, H. R., Simoncelli, E. P. (2004). Image quality</w:t>
-      </w:r>
-      <w:r>
-        <w:t xml:space="preserve"> </w:t>
-      </w:r>
-      <w:r>
-        <w:t xml:space="preserve">assessment: from error visibility to structural similarity.</w:t>
+        <w:t xml:space="preserve">Laino, D., Cabo, C., Ordóñez, C., et al. (2026). SegmentedForests: a labelled</w:t>
+      </w:r>
+      <w:r>
+        <w:t xml:space="preserve"> </w:t>
+      </w:r>
+      <w:r>
+        <w:t xml:space="preserve">dataset of terrestrial LiDAR point clouds for semantic segmentation of forests.</w:t>
       </w:r>
       <w:r>
         <w:t xml:space="preserve"> </w:t>
@@ -3099,13 +3058,79 @@
           <w:iCs/>
           <w:i/>
         </w:rPr>
-        <w:t xml:space="preserve">IEEE Transactions on</w:t>
+        <w:t xml:space="preserve">Forestry</w:t>
+      </w:r>
+      <w:r>
+        <w:t xml:space="preserve"> </w:t>
+      </w:r>
+      <w:r>
+        <w:t xml:space="preserve">99(2). https://doi.org/10.1093/forestry/cpaf062 · Data:</w:t>
+      </w:r>
+      <w:r>
+        <w:t xml:space="preserve"> </w:t>
+      </w:r>
+      <w:r>
+        <w:t xml:space="preserve">https://doi.org/10.5281/zenodo.17396681</w:t>
+      </w:r>
+    </w:p>
+    <w:p>
+      <w:pPr>
+        <w:pStyle w:val="BodyText"/>
+      </w:pPr>
+      <w:r>
+        <w:t xml:space="preserve">Meneghetti, G., Danelljan, M., Felsberg, M. (2015). Image alignment for</w:t>
+      </w:r>
+      <w:r>
+        <w:t xml:space="preserve"> </w:t>
+      </w:r>
+      <w:r>
+        <w:t xml:space="preserve">panorama stitching in sparsely structured environments [Dataset]. Zenodo.</w:t>
+      </w:r>
+      <w:r>
+        <w:t xml:space="preserve"> </w:t>
+      </w:r>
+      <w:r>
+        <w:t xml:space="preserve">CC BY 4.0. https://doi.org/10.5281/zenodo.19663081</w:t>
+      </w:r>
+    </w:p>
+    <w:p>
+      <w:pPr>
+        <w:pStyle w:val="BodyText"/>
+      </w:pPr>
+      <w:r>
+        <w:t xml:space="preserve">Petroff, M. A. (2019). Pannellum: a lightweight web-based panorama viewer.</w:t>
+      </w:r>
+      <w:r>
+        <w:t xml:space="preserve"> </w:t>
       </w:r>
       <w:r>
         <w:rPr>
           <w:iCs/>
           <w:i/>
         </w:rPr>
+        <w:t xml:space="preserve">Journal of Open Source Software</w:t>
+      </w:r>
+      <w:r>
+        <w:t xml:space="preserve"> </w:t>
+      </w:r>
+      <w:r>
+        <w:t xml:space="preserve">4(40), 1628.</w:t>
+      </w:r>
+      <w:r>
+        <w:t xml:space="preserve"> </w:t>
+      </w:r>
+      <w:r>
+        <w:t xml:space="preserve">https://doi.org/10.21105/joss.01628</w:t>
+      </w:r>
+    </w:p>
+    <w:p>
+      <w:pPr>
+        <w:pStyle w:val="BodyText"/>
+      </w:pPr>
+      <w:r>
+        <w:t xml:space="preserve">Sauro, J., Lewis, J. R. (2016).</w:t>
+      </w:r>
+      <w:r>
         <w:t xml:space="preserve"> </w:t>
       </w:r>
       <w:r>
@@ -3113,76 +3138,13 @@
           <w:iCs/>
           <w:i/>
         </w:rPr>
-        <w:t xml:space="preserve">Image Processing</w:t>
-      </w:r>
-      <w:r>
-        <w:t xml:space="preserve"> </w:t>
-      </w:r>
-      <w:r>
-        <w:t xml:space="preserve">13(4), 600–612. https://doi.org/10.1109/TIP.2003.819861</w:t>
-      </w:r>
-    </w:p>
-    <w:p>
-      <w:pPr>
-        <w:pStyle w:val="BodyText"/>
-      </w:pPr>
-      <w:r>
-        <w:t xml:space="preserve">[9] Kuglin, C. D., Hines, D. C. (1975). The phase correlation image alignment</w:t>
-      </w:r>
-      <w:r>
-        <w:t xml:space="preserve"> </w:t>
-      </w:r>
-      <w:r>
-        <w:t xml:space="preserve">method.</w:t>
-      </w:r>
-      <w:r>
-        <w:t xml:space="preserve"> </w:t>
+        <w:t xml:space="preserve">Quantifying the User Experience: Practical</w:t>
       </w:r>
       <w:r>
         <w:rPr>
           <w:iCs/>
           <w:i/>
         </w:rPr>
-        <w:t xml:space="preserve">Proc. IEEE Int. Conf. on Cybernetics and Society</w:t>
-      </w:r>
-      <w:r>
-        <w:t xml:space="preserve">, 163–165.</w:t>
-      </w:r>
-    </w:p>
-    <w:p>
-      <w:pPr>
-        <w:pStyle w:val="BodyText"/>
-      </w:pPr>
-      <w:r>
-        <w:t xml:space="preserve">[10] Meneghetti, G., Danelljan, M., Felsberg, M. (2015). Image alignment for</w:t>
-      </w:r>
-      <w:r>
-        <w:t xml:space="preserve"> </w:t>
-      </w:r>
-      <w:r>
-        <w:t xml:space="preserve">panorama stitching in sparsely structured environments [Dataset]. Zenodo.</w:t>
-      </w:r>
-      <w:r>
-        <w:t xml:space="preserve"> </w:t>
-      </w:r>
-      <w:r>
-        <w:t xml:space="preserve">CC BY 4.0. https://doi.org/10.5281/zenodo.19663081</w:t>
-      </w:r>
-    </w:p>
-    <w:p>
-      <w:pPr>
-        <w:pStyle w:val="BodyText"/>
-      </w:pPr>
-      <w:r>
-        <w:t xml:space="preserve">[11] Laino, D., Cabo, C., Prendes, C., et al. (2024). 3DFin: a software for</w:t>
-      </w:r>
-      <w:r>
-        <w:t xml:space="preserve"> </w:t>
-      </w:r>
-      <w:r>
-        <w:t xml:space="preserve">automated 3D forest inventories from terrestrial point clouds.</w:t>
-      </w:r>
-      <w:r>
         <w:t xml:space="preserve"> </w:t>
       </w:r>
       <w:r>
@@ -3190,19 +3152,10 @@
           <w:iCs/>
           <w:i/>
         </w:rPr>
-        <w:t xml:space="preserve">Forestry</w:t>
-      </w:r>
-      <w:r>
-        <w:t xml:space="preserve"> </w:t>
-      </w:r>
-      <w:r>
-        <w:t xml:space="preserve">97(4),</w:t>
-      </w:r>
-      <w:r>
-        <w:t xml:space="preserve"> </w:t>
-      </w:r>
-      <w:r>
-        <w:t xml:space="preserve">479–496. https://doi.org/10.1093/forestry/cpae020</w:t>
+        <w:t xml:space="preserve">Statistics for User Research</w:t>
+      </w:r>
+      <w:r>
+        <w:t xml:space="preserve">, 2nd ed., Morgan Kaufmann.</w:t>
       </w:r>
     </w:p>
     <w:p>
@@ -3210,13 +3163,7 @@
         <w:pStyle w:val="BodyText"/>
       </w:pPr>
       <w:r>
-        <w:t xml:space="preserve">[12] Laino, D., Cabo, C., Ordóñez, C., et al. (2026). SegmentedForests: a labelled</w:t>
-      </w:r>
-      <w:r>
-        <w:t xml:space="preserve"> </w:t>
-      </w:r>
-      <w:r>
-        <w:t xml:space="preserve">dataset of terrestrial LiDAR point clouds for semantic segmentation of forests.</w:t>
+        <w:t xml:space="preserve">Schütz, M. (2016).</w:t>
       </w:r>
       <w:r>
         <w:t xml:space="preserve"> </w:t>
@@ -3226,19 +3173,13 @@
           <w:iCs/>
           <w:i/>
         </w:rPr>
-        <w:t xml:space="preserve">Forestry</w:t>
-      </w:r>
-      <w:r>
-        <w:t xml:space="preserve"> </w:t>
-      </w:r>
-      <w:r>
-        <w:t xml:space="preserve">99(2). https://doi.org/10.1093/forestry/cpaf062 · Data:</w:t>
-      </w:r>
-      <w:r>
-        <w:t xml:space="preserve"> </w:t>
-      </w:r>
-      <w:r>
-        <w:t xml:space="preserve">https://doi.org/10.5281/zenodo.17396681</w:t>
+        <w:t xml:space="preserve">Potree: Rendering large point clouds in web browsers.</w:t>
+      </w:r>
+      <w:r>
+        <w:t xml:space="preserve"> </w:t>
+      </w:r>
+      <w:r>
+        <w:t xml:space="preserve">Diploma thesis, TU Wien.</w:t>
       </w:r>
     </w:p>
     <w:p>
@@ -3246,25 +3187,7 @@
         <w:pStyle w:val="BodyText"/>
       </w:pPr>
       <w:r>
-        <w:t xml:space="preserve">[13] Brooke, J. (1996). SUS: a</w:t>
-      </w:r>
-      <w:r>
-        <w:t xml:space="preserve"> </w:t>
-      </w:r>
-      <w:r>
-        <w:t xml:space="preserve">“</w:t>
-      </w:r>
-      <w:r>
-        <w:t xml:space="preserve">quick and dirty</w:t>
-      </w:r>
-      <w:r>
-        <w:t xml:space="preserve">”</w:t>
-      </w:r>
-      <w:r>
-        <w:t xml:space="preserve"> </w:t>
-      </w:r>
-      <w:r>
-        <w:t xml:space="preserve">usability scale. In:</w:t>
+        <w:t xml:space="preserve">Szeliski, R. (2006). Image alignment and stitching: a tutorial.</w:t>
       </w:r>
       <w:r>
         <w:t xml:space="preserve"> </w:t>
@@ -3274,7 +3197,7 @@
           <w:iCs/>
           <w:i/>
         </w:rPr>
-        <w:t xml:space="preserve">Usability</w:t>
+        <w:t xml:space="preserve">Foundations</w:t>
       </w:r>
       <w:r>
         <w:rPr>
@@ -3288,10 +3211,19 @@
           <w:iCs/>
           <w:i/>
         </w:rPr>
-        <w:t xml:space="preserve">Evaluation in Industry</w:t>
-      </w:r>
-      <w:r>
-        <w:t xml:space="preserve">, Taylor &amp; Francis, 189–194.</w:t>
+        <w:t xml:space="preserve">and Trends in Computer Graphics and Vision</w:t>
+      </w:r>
+      <w:r>
+        <w:t xml:space="preserve"> </w:t>
+      </w:r>
+      <w:r>
+        <w:t xml:space="preserve">2(1), 1–104.</w:t>
+      </w:r>
+      <w:r>
+        <w:t xml:space="preserve"> </w:t>
+      </w:r>
+      <w:r>
+        <w:t xml:space="preserve">https://doi.org/10.1561/0600000009</w:t>
       </w:r>
     </w:p>
     <w:p>
@@ -3299,7 +3231,13 @@
         <w:pStyle w:val="BodyText"/>
       </w:pPr>
       <w:r>
-        <w:t xml:space="preserve">[14] Sauro, J., Lewis, J. R. (2016).</w:t>
+        <w:t xml:space="preserve">Wang, Z., Bovik, A. C., Sheikh, H. R., Simoncelli, E. P. (2004). Image quality</w:t>
+      </w:r>
+      <w:r>
+        <w:t xml:space="preserve"> </w:t>
+      </w:r>
+      <w:r>
+        <w:t xml:space="preserve">assessment: from error visibility to structural similarity.</w:t>
       </w:r>
       <w:r>
         <w:t xml:space="preserve"> </w:t>
@@ -3309,7 +3247,7 @@
           <w:iCs/>
           <w:i/>
         </w:rPr>
-        <w:t xml:space="preserve">Quantifying the User Experience: Practical</w:t>
+        <w:t xml:space="preserve">IEEE Transactions on</w:t>
       </w:r>
       <w:r>
         <w:rPr>
@@ -3323,54 +3261,13 @@
           <w:iCs/>
           <w:i/>
         </w:rPr>
-        <w:t xml:space="preserve">Statistics for User Research</w:t>
-      </w:r>
-      <w:r>
-        <w:t xml:space="preserve">, 2nd ed., Morgan Kaufmann.</w:t>
-      </w:r>
-    </w:p>
-    <w:p>
-      <w:pPr>
-        <w:pStyle w:val="BodyText"/>
-      </w:pPr>
-      <w:r>
-        <w:t xml:space="preserve">[15] Chang, M., Candotti, A., von Ellenrieder, K., Tomelleri, E., Camurri, M.</w:t>
-      </w:r>
-      <w:r>
-        <w:t xml:space="preserve"> </w:t>
-      </w:r>
-      <w:r>
-        <w:t xml:space="preserve">(2025). Data for:</w:t>
-      </w:r>
-      <w:r>
-        <w:t xml:space="preserve"> </w:t>
-      </w:r>
-      <w:r>
-        <w:t xml:space="preserve">“</w:t>
-      </w:r>
-      <w:r>
-        <w:t xml:space="preserve">A multi-platform LiDAR dataset for standardized forest</w:t>
-      </w:r>
-      <w:r>
-        <w:t xml:space="preserve"> </w:t>
-      </w:r>
-      <w:r>
-        <w:t xml:space="preserve">inventory measurement at long term ecological monitoring sites</w:t>
-      </w:r>
-      <w:r>
-        <w:t xml:space="preserve">”</w:t>
-      </w:r>
-      <w:r>
-        <w:t xml:space="preserve"> </w:t>
-      </w:r>
-      <w:r>
-        <w:t xml:space="preserve">[Dataset].</w:t>
-      </w:r>
-      <w:r>
-        <w:t xml:space="preserve"> </w:t>
-      </w:r>
-      <w:r>
-        <w:t xml:space="preserve">Zenodo. https://doi.org/10.5281/zenodo.17186174</w:t>
+        <w:t xml:space="preserve">Image Processing</w:t>
+      </w:r>
+      <w:r>
+        <w:t xml:space="preserve"> </w:t>
+      </w:r>
+      <w:r>
+        <w:t xml:space="preserve">13(4), 600–612. https://doi.org/10.1109/TIP.2003.819861</w:t>
       </w:r>
     </w:p>
     <w:p>
@@ -3409,8 +3306,12 @@
         <w:t xml:space="preserve">isolated as a separate process).</w:t>
       </w:r>
     </w:p>
-    <w:bookmarkEnd w:id="41"/>
-    <w:sectPr/>
+    <w:bookmarkEnd w:id="40"/>
+    <w:sectPr>
+      <w:pgSz w:h="16838" w:w="11906"/>
+      <w:pgMar w:bottom="1134" w:footer="708" w:gutter="0" w:header="708" w:left="1417" w:right="1417" w:top="1417"/>
+      <w:lnNumType w:countBy="1" w:restart="continuous"/>
+    </w:sectPr>
   </w:body>
 </w:document>
 </file>
@@ -3599,9 +3500,6 @@
     <w:abstractNumId w:val="991"/>
   </w:num>
   <w:num w:numId="1002">
-    <w:abstractNumId w:val="991"/>
-  </w:num>
-  <w:num w:numId="1003">
     <w:abstractNumId w:val="991"/>
   </w:num>
 </w:numbering>
@@ -3620,7 +3518,7 @@
     </w:rPrDefault>
     <w:pPrDefault>
       <w:pPr>
-        <w:spacing w:after="200"/>
+        <w:spacing w:after="200" w:line="480" w:lineRule="auto"/>
       </w:pPr>
     </w:pPrDefault>
   </w:docDefaults>
@@ -3634,7 +3532,7 @@
     <w:basedOn w:val="Normal"/>
     <w:link w:val="BodyTextChar"/>
     <w:pPr>
-      <w:spacing w:after="180" w:before="180"/>
+      <w:spacing w:after="180" w:before="180" w:line="480" w:lineRule="auto"/>
     </w:pPr>
     <w:qFormat/>
   </w:style>
@@ -3649,7 +3547,7 @@
     <w:basedOn w:val="BodyText"/>
     <w:qFormat/>
     <w:pPr>
-      <w:spacing w:after="36" w:before="36"/>
+      <w:spacing w:after="36" w:before="36" w:line="480" w:lineRule="auto"/>
     </w:pPr>
   </w:style>
   <w:style w:styleId="Title" w:type="paragraph">
@@ -3660,7 +3558,7 @@
     <w:pPr>
       <w:keepNext/>
       <w:keepLines/>
-      <w:spacing w:after="240" w:before="480"/>
+      <w:spacing w:after="240" w:before="480" w:line="480" w:lineRule="auto"/>
       <w:jc w:val="center"/>
     </w:pPr>
     <w:rPr>
@@ -3680,7 +3578,7 @@
     <w:pPr>
       <w:keepNext/>
       <w:keepLines/>
-      <w:spacing w:after="240" w:before="240"/>
+      <w:spacing w:after="240" w:before="240" w:line="480" w:lineRule="auto"/>
       <w:jc w:val="center"/>
     </w:pPr>
     <w:rPr>
@@ -3717,7 +3615,7 @@
       <w:keepNext/>
       <w:keepLines/>
       <w:jc w:val="center"/>
-      <w:spacing w:after="0" w:before="300"/>
+      <w:spacing w:after="0" w:before="300" w:line="480" w:lineRule="auto"/>
     </w:pPr>
     <w:rPr>
       <w:sz w:val="20"/>
@@ -3735,7 +3633,7 @@
     <w:pPr>
       <w:keepNext/>
       <w:keepLines/>
-      <w:spacing w:after="300" w:before="100"/>
+      <w:spacing w:after="300" w:before="100" w:line="480" w:lineRule="auto"/>
     </w:pPr>
     <w:rPr>
       <w:sz w:val="20"/>
@@ -3759,7 +3657,7 @@
     <w:pPr>
       <w:keepNext/>
       <w:keepLines/>
-      <w:spacing w:after="0" w:before="480"/>
+      <w:spacing w:after="0" w:before="480" w:line="480" w:lineRule="auto"/>
       <w:outlineLvl w:val="0"/>
     </w:pPr>
     <w:rPr>
@@ -3781,7 +3679,7 @@
     <w:pPr>
       <w:keepNext/>
       <w:keepLines/>
-      <w:spacing w:after="0" w:before="200"/>
+      <w:spacing w:after="0" w:before="200" w:line="480" w:lineRule="auto"/>
       <w:outlineLvl w:val="1"/>
     </w:pPr>
     <w:rPr>
@@ -3803,7 +3701,7 @@
     <w:pPr>
       <w:keepNext/>
       <w:keepLines/>
-      <w:spacing w:after="0" w:before="200"/>
+      <w:spacing w:after="0" w:before="200" w:line="480" w:lineRule="auto"/>
       <w:outlineLvl w:val="2"/>
     </w:pPr>
     <w:rPr>
@@ -3825,7 +3723,7 @@
     <w:pPr>
       <w:keepNext/>
       <w:keepLines/>
-      <w:spacing w:after="0" w:before="200"/>
+      <w:spacing w:after="0" w:before="200" w:line="480" w:lineRule="auto"/>
       <w:outlineLvl w:val="3"/>
     </w:pPr>
     <w:rPr>
@@ -3847,7 +3745,7 @@
     <w:pPr>
       <w:keepNext/>
       <w:keepLines/>
-      <w:spacing w:after="0" w:before="200"/>
+      <w:spacing w:after="0" w:before="200" w:line="480" w:lineRule="auto"/>
       <w:outlineLvl w:val="4"/>
     </w:pPr>
     <w:rPr>
@@ -3868,7 +3766,7 @@
     <w:pPr>
       <w:keepNext/>
       <w:keepLines/>
-      <w:spacing w:after="0" w:before="200"/>
+      <w:spacing w:after="0" w:before="200" w:line="480" w:lineRule="auto"/>
       <w:outlineLvl w:val="5"/>
     </w:pPr>
     <w:rPr>
@@ -3888,7 +3786,7 @@
     <w:pPr>
       <w:keepNext/>
       <w:keepLines/>
-      <w:spacing w:after="0" w:before="200"/>
+      <w:spacing w:after="0" w:before="200" w:line="480" w:lineRule="auto"/>
       <w:outlineLvl w:val="6"/>
     </w:pPr>
     <w:rPr>
@@ -3908,7 +3806,7 @@
     <w:pPr>
       <w:keepNext/>
       <w:keepLines/>
-      <w:spacing w:after="0" w:before="200"/>
+      <w:spacing w:after="0" w:before="200" w:line="480" w:lineRule="auto"/>
       <w:outlineLvl w:val="7"/>
     </w:pPr>
     <w:rPr>
@@ -3928,7 +3826,7 @@
     <w:pPr>
       <w:keepNext/>
       <w:keepLines/>
-      <w:spacing w:after="0" w:before="200"/>
+      <w:spacing w:after="0" w:before="200" w:line="480" w:lineRule="auto"/>
       <w:outlineLvl w:val="8"/>
     </w:pPr>
     <w:rPr>
@@ -3946,7 +3844,7 @@
     <w:unhideWhenUsed/>
     <w:qFormat/>
     <w:pPr>
-      <w:spacing w:after="100" w:before="100"/>
+      <w:spacing w:after="100" w:before="100" w:line="480" w:lineRule="auto"/>
       <w:ind w:firstLine="0" w:left="480" w:right="480"/>
     </w:pPr>
   </w:style>
@@ -4001,7 +3899,7 @@
     <w:pPr>
       <w:keepNext/>
       <w:keepLines/>
-      <w:spacing w:after="0"/>
+      <w:spacing w:after="0" w:line="480" w:lineRule="auto"/>
     </w:pPr>
     <w:rPr>
       <w:b/>
@@ -4016,7 +3914,7 @@
     <w:basedOn w:val="Normal"/>
     <w:link w:val="BodyTextChar"/>
     <w:pPr>
-      <w:spacing w:after="120" w:before="0"/>
+      <w:spacing w:after="120" w:before="0" w:line="480" w:lineRule="auto"/>
     </w:pPr>
     <w:rPr>
       <w:i/>
@@ -4083,7 +3981,7 @@
     <w:unhideWhenUsed/>
     <w:qFormat/>
     <w:pPr>
-      <w:spacing w:before="240" w:line="259" w:lineRule="auto"/>
+      <w:spacing w:before="240" w:line="480" w:lineRule="auto"/>
       <w:outlineLvl w:val="9"/>
     </w:pPr>
     <w:rPr>

</xml_diff>